<commit_message>
fix(rapport) : add details rules in rapport
</commit_message>
<xml_diff>
--- a/docs/rapport/Rapport_Orientation.docx
+++ b/docs/rapport/Rapport_Orientation.docx
@@ -3,24 +3,8 @@
 <w:document xmlns:wpc="http://schemas.microsoft.com/office/word/2010/wordprocessingCanvas" xmlns:mc="http://schemas.openxmlformats.org/markup-compatibility/2006" xmlns:o="urn:schemas-microsoft-com:office:office" xmlns:r="http://schemas.openxmlformats.org/officeDocument/2006/relationships" xmlns:m="http://schemas.openxmlformats.org/officeDocument/2006/math" xmlns:v="urn:schemas-microsoft-com:vml" xmlns:wp14="http://schemas.microsoft.com/office/word/2010/wordprocessingDrawing" xmlns:wp="http://schemas.openxmlformats.org/drawingml/2006/wordprocessingDrawing" xmlns:w10="urn:schemas-microsoft-com:office:word" xmlns:w="http://schemas.openxmlformats.org/wordprocessingml/2006/main" xmlns:w14="http://schemas.microsoft.com/office/word/2010/wordml" xmlns:wpg="http://schemas.microsoft.com/office/word/2010/wordprocessingGroup" xmlns:wpi="http://schemas.microsoft.com/office/word/2010/wordprocessingInk" xmlns:wne="http://schemas.microsoft.com/office/word/2006/wordml" xmlns:wps="http://schemas.microsoft.com/office/word/2010/wordprocessingShape" mc:Ignorable="w14 wp14">
   <w:body>
     <w:p>
-      <w:pPr>
-        <w:rPr>
-          <w:noProof/>
-          <w:lang w:val="fr-FR" w:eastAsia="fr-FR"/>
-        </w:rPr>
-      </w:pPr>
       <w:r>
-        <w:rPr>
-          <w:lang w:val="fr-FR"/>
-        </w:rPr>
-        <w:t xml:space="preserve">                                                          </w:t>
-      </w:r>
-      <w:r>
-        <w:rPr>
-          <w:noProof/>
-          <w:lang w:val="fr-FR" w:eastAsia="fr-FR"/>
-        </w:rPr>
-        <w:t xml:space="preserve">   </w:t>
+        <w:t xml:space="preserve">                                                                    </w:t>
       </w:r>
       <w:r>
         <w:rPr>
@@ -28,10 +12,10 @@
           <w:lang w:val="fr-FR" w:eastAsia="fr-FR"/>
         </w:rPr>
         <w:drawing>
-          <wp:inline distT="0" distB="0" distL="0" distR="0" wp14:anchorId="70D098D4" wp14:editId="0D84029E">
-            <wp:extent cx="2215662" cy="931985"/>
-            <wp:effectExtent l="0" t="0" r="0" b="1905"/>
-            <wp:docPr id="4" name="Image 4"/>
+          <wp:inline distT="0" distB="0" distL="0" distR="0" wp14:anchorId="251CA05E" wp14:editId="5640FF34">
+            <wp:extent cx="1514475" cy="700088"/>
+            <wp:effectExtent l="0" t="0" r="0" b="5080"/>
+            <wp:docPr id="3" name="Image 3"/>
             <wp:cNvGraphicFramePr>
               <a:graphicFrameLocks xmlns:a="http://schemas.openxmlformats.org/drawingml/2006/main" noChangeAspect="1"/>
             </wp:cNvGraphicFramePr>
@@ -57,7 +41,7 @@
                   <pic:spPr>
                     <a:xfrm>
                       <a:off x="0" y="0"/>
-                      <a:ext cx="2216076" cy="932159"/>
+                      <a:ext cx="1514475" cy="700088"/>
                     </a:xfrm>
                     <a:prstGeom prst="rect">
                       <a:avLst/>
@@ -69,64 +53,22 @@
           </wp:inline>
         </w:drawing>
       </w:r>
-      <w:r>
-        <w:rPr>
-          <w:noProof/>
-          <w:lang w:val="fr-FR" w:eastAsia="fr-FR"/>
-        </w:rPr>
-        <w:t xml:space="preserve">                </w:t>
-      </w:r>
     </w:p>
-    <w:p>
-      <w:pPr>
-        <w:rPr>
-          <w:noProof/>
-          <w:lang w:val="fr-FR" w:eastAsia="fr-FR"/>
-        </w:rPr>
-      </w:pPr>
-    </w:p>
-    <w:p>
-      <w:pPr>
-        <w:rPr>
-          <w:noProof/>
-          <w:lang w:val="fr-FR" w:eastAsia="fr-FR"/>
-        </w:rPr>
-      </w:pPr>
-    </w:p>
-    <w:p>
-      <w:pPr>
-        <w:rPr>
-          <w:noProof/>
-          <w:lang w:val="fr-FR" w:eastAsia="fr-FR"/>
-        </w:rPr>
-      </w:pPr>
-    </w:p>
-    <w:p>
-      <w:pPr>
-        <w:rPr>
-          <w:lang w:val="fr-FR"/>
-        </w:rPr>
-      </w:pPr>
-      <w:r>
-        <w:rPr>
-          <w:noProof/>
-          <w:lang w:val="fr-FR" w:eastAsia="fr-FR"/>
-        </w:rPr>
-        <w:t xml:space="preserve">                                                                        </w:t>
-      </w:r>
-    </w:p>
+    <w:p/>
+    <w:p/>
+    <w:p/>
     <w:p>
       <w:pPr>
         <w:jc w:val="center"/>
         <w:rPr>
-          <w:color w:val="244061" w:themeColor="accent1" w:themeShade="80"/>
+          <w:color w:val="17365D" w:themeColor="text2" w:themeShade="BF"/>
           <w:lang w:val="fr-FR"/>
         </w:rPr>
       </w:pPr>
       <w:r>
         <w:rPr>
           <w:b/>
-          <w:color w:val="244061" w:themeColor="accent1" w:themeShade="80"/>
+          <w:color w:val="17365D" w:themeColor="text2" w:themeShade="BF"/>
           <w:sz w:val="40"/>
           <w:lang w:val="fr-FR"/>
         </w:rPr>
@@ -135,7 +77,7 @@
       <w:r>
         <w:rPr>
           <w:b/>
-          <w:color w:val="244061" w:themeColor="accent1" w:themeShade="80"/>
+          <w:color w:val="17365D" w:themeColor="text2" w:themeShade="BF"/>
           <w:sz w:val="40"/>
           <w:lang w:val="fr-FR"/>
         </w:rPr>
@@ -163,7 +105,7 @@
           <w:sz w:val="24"/>
           <w:lang w:val="fr-FR"/>
         </w:rPr>
-        <w:t>Encadré par :</w:t>
+        <w:t xml:space="preserve">Encadré par : </w:t>
       </w:r>
     </w:p>
     <w:p>
@@ -179,21 +121,14 @@
           <w:sz w:val="24"/>
           <w:lang w:val="fr-FR"/>
         </w:rPr>
-        <w:t>Prof.</w:t>
+        <w:t xml:space="preserve">Prof. </w:t>
       </w:r>
       <w:r>
         <w:rPr>
           <w:sz w:val="24"/>
           <w:lang w:val="fr-FR"/>
         </w:rPr>
-        <w:t xml:space="preserve"> </w:t>
-      </w:r>
-      <w:r>
-        <w:rPr>
-          <w:sz w:val="24"/>
-          <w:lang w:val="fr-FR"/>
-        </w:rPr>
-        <w:t xml:space="preserve"> </w:t>
+        <w:t xml:space="preserve">Mohamed </w:t>
       </w:r>
       <w:r>
         <w:rPr>
@@ -235,13 +170,14 @@
           <w:lang w:val="fr-FR"/>
         </w:rPr>
         <w:br/>
-        <w:t>Réalisé par :</w:t>
+        <w:t xml:space="preserve">Réalisé par : </w:t>
       </w:r>
     </w:p>
     <w:p>
       <w:pPr>
         <w:jc w:val="center"/>
         <w:rPr>
+          <w:sz w:val="24"/>
           <w:lang w:val="fr-FR"/>
         </w:rPr>
       </w:pPr>
@@ -250,11 +186,53 @@
           <w:sz w:val="24"/>
           <w:lang w:val="fr-FR"/>
         </w:rPr>
-        <w:t xml:space="preserve"> EL JARJINI Yassine</w:t>
+        <w:t>Yassine</w:t>
+      </w:r>
+      <w:r>
+        <w:rPr>
+          <w:sz w:val="24"/>
+          <w:lang w:val="fr-FR"/>
+        </w:rPr>
+        <w:t xml:space="preserve"> </w:t>
+      </w:r>
+      <w:r>
+        <w:rPr>
+          <w:sz w:val="24"/>
+          <w:lang w:val="fr-FR"/>
+        </w:rPr>
+        <w:t>EL JARJINI</w:t>
       </w:r>
     </w:p>
     <w:p>
       <w:pPr>
+        <w:jc w:val="center"/>
+        <w:rPr>
+          <w:sz w:val="24"/>
+          <w:lang w:val="fr-FR"/>
+        </w:rPr>
+      </w:pPr>
+    </w:p>
+    <w:p>
+      <w:pPr>
+        <w:jc w:val="center"/>
+        <w:rPr>
+          <w:sz w:val="24"/>
+          <w:lang w:val="fr-FR"/>
+        </w:rPr>
+      </w:pPr>
+    </w:p>
+    <w:p>
+      <w:pPr>
+        <w:jc w:val="center"/>
+        <w:rPr>
+          <w:sz w:val="24"/>
+          <w:lang w:val="fr-FR"/>
+        </w:rPr>
+      </w:pPr>
+    </w:p>
+    <w:p>
+      <w:pPr>
+        <w:jc w:val="center"/>
         <w:rPr>
           <w:lang w:val="fr-FR"/>
         </w:rPr>
@@ -269,37 +247,11 @@
     </w:p>
     <w:p>
       <w:pPr>
-        <w:rPr>
-          <w:lang w:val="fr-FR"/>
-        </w:rPr>
-      </w:pPr>
-    </w:p>
-    <w:p>
-      <w:pPr>
-        <w:rPr>
-          <w:lang w:val="fr-FR"/>
-        </w:rPr>
-      </w:pPr>
-      <w:r>
-        <w:rPr>
-          <w:lang w:val="fr-FR"/>
-        </w:rPr>
-        <w:t xml:space="preserve"> </w:t>
-      </w:r>
-    </w:p>
-    <w:p>
-      <w:pPr>
         <w:jc w:val="center"/>
         <w:rPr>
           <w:lang w:val="fr-FR"/>
         </w:rPr>
       </w:pPr>
-      <w:r>
-        <w:rPr>
-          <w:lang w:val="fr-FR"/>
-        </w:rPr>
-        <w:t xml:space="preserve">                                                                                      </w:t>
-      </w:r>
       <w:r>
         <w:rPr>
           <w:lang w:val="fr-FR"/>
@@ -377,7 +329,50 @@
         <w:rPr>
           <w:lang w:val="fr-FR"/>
         </w:rPr>
-        <w:t>2. Workflow du moteur d’inférence – Chaînage avant</w:t>
+        <w:t>2. Diagramme de communication (flux des données)</w:t>
+      </w:r>
+    </w:p>
+    <w:p>
+      <w:r>
+        <w:rPr>
+          <w:noProof/>
+          <w:lang w:val="fr-FR" w:eastAsia="fr-FR"/>
+        </w:rPr>
+        <w:drawing>
+          <wp:inline distT="0" distB="0" distL="0" distR="0">
+            <wp:extent cx="5486400" cy="5524150"/>
+            <wp:effectExtent l="0" t="0" r="0" b="0"/>
+            <wp:docPr id="1" name="Picture 1"/>
+            <wp:cNvGraphicFramePr>
+              <a:graphicFrameLocks xmlns:a="http://schemas.openxmlformats.org/drawingml/2006/main" noChangeAspect="1"/>
+            </wp:cNvGraphicFramePr>
+            <a:graphic xmlns:a="http://schemas.openxmlformats.org/drawingml/2006/main">
+              <a:graphicData uri="http://schemas.openxmlformats.org/drawingml/2006/picture">
+                <pic:pic xmlns:pic="http://schemas.openxmlformats.org/drawingml/2006/picture">
+                  <pic:nvPicPr>
+                    <pic:cNvPr id="0" name="Communication2.png"/>
+                    <pic:cNvPicPr/>
+                  </pic:nvPicPr>
+                  <pic:blipFill>
+                    <a:blip r:embed="rId10"/>
+                    <a:stretch>
+                      <a:fillRect/>
+                    </a:stretch>
+                  </pic:blipFill>
+                  <pic:spPr>
+                    <a:xfrm>
+                      <a:off x="0" y="0"/>
+                      <a:ext cx="5486400" cy="5524150"/>
+                    </a:xfrm>
+                    <a:prstGeom prst="rect">
+                      <a:avLst/>
+                    </a:prstGeom>
+                  </pic:spPr>
+                </pic:pic>
+              </a:graphicData>
+            </a:graphic>
+          </wp:inline>
+        </w:drawing>
       </w:r>
     </w:p>
     <w:p>
@@ -390,13 +385,61 @@
         <w:rPr>
           <w:lang w:val="fr-FR"/>
         </w:rPr>
-        <w:t xml:space="preserve">Le moteur utilise </w:t>
+        <w:lastRenderedPageBreak/>
+        <w:t>Ce diagramme illus</w:t>
       </w:r>
       <w:r>
         <w:rPr>
           <w:lang w:val="fr-FR"/>
         </w:rPr>
-        <w:t>un chaînage avant (</w:t>
+        <w:t xml:space="preserve">tre la circulation des informations entre les composants : les entrées (Notes, Préférences, Qualités, RIASEC, Valeurs) sont agrégées dans </w:t>
+      </w:r>
+      <w:proofErr w:type="spellStart"/>
+      <w:r>
+        <w:rPr>
+          <w:lang w:val="fr-FR"/>
+        </w:rPr>
+        <w:t>StudentFact</w:t>
+      </w:r>
+      <w:proofErr w:type="spellEnd"/>
+      <w:r>
+        <w:rPr>
+          <w:lang w:val="fr-FR"/>
+        </w:rPr>
+        <w:t>, puis traitées par les règles et le calculateur de bonus, avant d'être converties en pourcentages et d'ali</w:t>
+      </w:r>
+      <w:r>
+        <w:rPr>
+          <w:lang w:val="fr-FR"/>
+        </w:rPr>
+        <w:t>menter les sorties (graphique, recommandation, lettre).</w:t>
+      </w:r>
+    </w:p>
+    <w:p>
+      <w:pPr>
+        <w:pStyle w:val="Titre1"/>
+        <w:rPr>
+          <w:lang w:val="fr-FR"/>
+        </w:rPr>
+      </w:pPr>
+      <w:r>
+        <w:rPr>
+          <w:lang w:val="fr-FR"/>
+        </w:rPr>
+        <w:t>3. Workflow du moteur d’inférence – Chaînage avant</w:t>
+      </w:r>
+    </w:p>
+    <w:p>
+      <w:pPr>
+        <w:rPr>
+          <w:lang w:val="fr-FR"/>
+        </w:rPr>
+      </w:pPr>
+      <w:r>
+        <w:rPr>
+          <w:lang w:val="fr-FR"/>
+        </w:rPr>
+        <w:t>Le moteur utilise un chaînage avant (</w:t>
       </w:r>
       <w:proofErr w:type="spellStart"/>
       <w:r>
@@ -424,7 +467,13 @@
         <w:rPr>
           <w:lang w:val="fr-FR"/>
         </w:rPr>
-        <w:t>) : à partir des faits initiaux (notes, préférences, qualités, RIASEC, valeurs), il applique des règles pour construire progressivement les scores.</w:t>
+        <w:t>) : à partir des faits initiaux, il applique des règles pour construire progressivement les scor</w:t>
+      </w:r>
+      <w:r>
+        <w:rPr>
+          <w:lang w:val="fr-FR"/>
+        </w:rPr>
+        <w:t>es.</w:t>
       </w:r>
     </w:p>
     <w:p>
@@ -438,13 +487,7 @@
         <w:rPr>
           <w:lang w:val="fr-FR"/>
         </w:rPr>
-        <w:t>Saisie des données (notes, préférences, qualités, RIASEC 1-10, valeurs 1-</w:t>
-      </w:r>
-      <w:r>
-        <w:rPr>
-          <w:lang w:val="fr-FR"/>
-        </w:rPr>
-        <w:t>10)</w:t>
+        <w:t>Saisie des données (notes, préférences, qualités, RIASEC 1-10, valeurs 1-10)</w:t>
       </w:r>
     </w:p>
     <w:p>
@@ -484,9 +527,17 @@
         <w:rPr>
           <w:lang w:val="fr-FR"/>
         </w:rPr>
-        <w:t>Application des règles : académiques (5 domaines), RIASEC, valeurs</w:t>
+        <w:t xml:space="preserve">Application des règles : </w:t>
+      </w:r>
+      <w:bookmarkStart w:id="0" w:name="_GoBack"/>
+      <w:r>
+        <w:rPr>
+          <w:lang w:val="fr-FR"/>
+        </w:rPr>
+        <w:t>académiques (5 domaines), RIASEC, valeurs</w:t>
       </w:r>
     </w:p>
+    <w:bookmarkEnd w:id="0"/>
     <w:p>
       <w:pPr>
         <w:pStyle w:val="Listepuces"/>
@@ -513,7 +564,10 @@
         <w:pStyle w:val="Listepuces"/>
       </w:pPr>
       <w:r>
-        <w:t>Conversion en pourcentages (normalisation)</w:t>
+        <w:t>Conversion en pourcentages (normalis</w:t>
+      </w:r>
+      <w:r>
+        <w:t>ation)</w:t>
       </w:r>
     </w:p>
     <w:p>
@@ -527,13 +581,7 @@
         <w:rPr>
           <w:lang w:val="fr-FR"/>
         </w:rPr>
-        <w:t>Affichage des résultats : pourcentages, graphique, recommandation, let</w:t>
-      </w:r>
-      <w:r>
-        <w:rPr>
-          <w:lang w:val="fr-FR"/>
-        </w:rPr>
-        <w:t>tre d’orientation</w:t>
+        <w:t>Affichage des résultats : pourcentages, graphique, recommandation, lettre d’orientation</w:t>
       </w:r>
     </w:p>
     <w:p>
@@ -546,7 +594,13 @@
         <w:rPr>
           <w:lang w:val="fr-FR"/>
         </w:rPr>
-        <w:t>Le chaînage avant part des faits et déclenche toutes les règles dont les conditions sont satisfaites, accumulant les scores jusqu’à obtenir une conclusion (les pourcentages). Aucune hypothèse de départ n’est posée.</w:t>
+        <w:t>Le chaînage avant part des faits et déclenche toutes les règles dont les conditions sont satisfaites, accumulant les scores jusqu’à obtenir une conclusion (les p</w:t>
+      </w:r>
+      <w:r>
+        <w:rPr>
+          <w:lang w:val="fr-FR"/>
+        </w:rPr>
+        <w:t>ourcentages). Aucune hypothèse de départ n’est posée.</w:t>
       </w:r>
     </w:p>
     <w:p>
@@ -560,13 +614,21 @@
         <w:rPr>
           <w:lang w:val="fr-FR"/>
         </w:rPr>
-        <w:t>3. Modèle RIASEC (Holla</w:t>
+        <w:t>4. Détail des règles d’évaluation</w:t>
       </w:r>
+    </w:p>
+    <w:p>
+      <w:pPr>
+        <w:pStyle w:val="Titre2"/>
+        <w:rPr>
+          <w:lang w:val="fr-FR"/>
+        </w:rPr>
+      </w:pPr>
       <w:r>
         <w:rPr>
           <w:lang w:val="fr-FR"/>
         </w:rPr>
-        <w:t>nd)</w:t>
+        <w:t>4.1 Règles académiques</w:t>
       </w:r>
     </w:p>
     <w:p>
@@ -579,7 +641,271 @@
         <w:rPr>
           <w:lang w:val="fr-FR"/>
         </w:rPr>
-        <w:t>Développé par John Holland, ce modèle classe les personnalités professionnelles en 6 types : Réaliste (R), Investigateur (I), Artistique (A), Social (S), Entreprenant (E), Conventionnel (C).</w:t>
+        <w:t>Chaque domaine possède une règle spécifique basée sur les notes et certaines qualités :</w:t>
+      </w:r>
+    </w:p>
+    <w:p>
+      <w:pPr>
+        <w:pStyle w:val="Listepuces"/>
+        <w:rPr>
+          <w:lang w:val="fr-FR"/>
+        </w:rPr>
+      </w:pPr>
+      <w:r>
+        <w:rPr>
+          <w:lang w:val="fr-FR"/>
+        </w:rPr>
+        <w:t>• Ingénierie : maths ≥14 ET physique ≥14 (excellent) ou ≥</w:t>
+      </w:r>
+      <w:r>
+        <w:rPr>
+          <w:lang w:val="fr-FR"/>
+        </w:rPr>
+        <w:t>12 (moyen) ; bonus pour qualités analytiques, logiques, résolution de problèmes.</w:t>
+      </w:r>
+    </w:p>
+    <w:p>
+      <w:pPr>
+        <w:pStyle w:val="Listepuces"/>
+        <w:rPr>
+          <w:lang w:val="fr-FR"/>
+        </w:rPr>
+      </w:pPr>
+      <w:r>
+        <w:rPr>
+          <w:lang w:val="fr-FR"/>
+        </w:rPr>
+        <w:t>• Médecine : biologie ≥15 ET chimie ≥14 (excellent) ou ≥13/12 (moyen) ; bonus pour empathie, patience, rigueur.</w:t>
+      </w:r>
+    </w:p>
+    <w:p>
+      <w:pPr>
+        <w:pStyle w:val="Listepuces"/>
+        <w:rPr>
+          <w:lang w:val="fr-FR"/>
+        </w:rPr>
+      </w:pPr>
+      <w:r>
+        <w:rPr>
+          <w:lang w:val="fr-FR"/>
+        </w:rPr>
+        <w:t>• Design : arts ≥14 (excellent) ou ≥11 (moyen) ; bonus pour cré</w:t>
+      </w:r>
+      <w:r>
+        <w:rPr>
+          <w:lang w:val="fr-FR"/>
+        </w:rPr>
+        <w:t>ativité, sens artistique, imagination.</w:t>
+      </w:r>
+    </w:p>
+    <w:p>
+      <w:pPr>
+        <w:pStyle w:val="Listepuces"/>
+        <w:rPr>
+          <w:lang w:val="fr-FR"/>
+        </w:rPr>
+      </w:pPr>
+      <w:r>
+        <w:rPr>
+          <w:lang w:val="fr-FR"/>
+        </w:rPr>
+        <w:t>• Droit : français ≥14 ET philosophie ≥13 (excellent) ou ≥12/11 (moyen) ; bonus pour argumentation, rigueur, analyse.</w:t>
+      </w:r>
+    </w:p>
+    <w:p>
+      <w:pPr>
+        <w:pStyle w:val="Listepuces"/>
+        <w:rPr>
+          <w:lang w:val="fr-FR"/>
+        </w:rPr>
+      </w:pPr>
+      <w:r>
+        <w:rPr>
+          <w:lang w:val="fr-FR"/>
+        </w:rPr>
+        <w:t xml:space="preserve">• Commerce : économie ≥14 (excellent) ou ≥11 (moyen) ; bonus pour leadership, communication, </w:t>
+      </w:r>
+      <w:r>
+        <w:rPr>
+          <w:lang w:val="fr-FR"/>
+        </w:rPr>
+        <w:t>négociation.</w:t>
+      </w:r>
+    </w:p>
+    <w:p>
+      <w:pPr>
+        <w:pStyle w:val="Titre2"/>
+        <w:rPr>
+          <w:lang w:val="fr-FR"/>
+        </w:rPr>
+      </w:pPr>
+      <w:r>
+        <w:rPr>
+          <w:lang w:val="fr-FR"/>
+        </w:rPr>
+        <w:t>4.2 Règles RIASEC</w:t>
+      </w:r>
+    </w:p>
+    <w:p>
+      <w:r>
+        <w:rPr>
+          <w:lang w:val="fr-FR"/>
+        </w:rPr>
+        <w:t xml:space="preserve">L'étudiant note chaque type RIASEC de 1 à 10. Une matrice de correspondance attribue des coefficients aux domaines. </w:t>
+      </w:r>
+      <w:r>
+        <w:t xml:space="preserve">Le </w:t>
+      </w:r>
+      <w:proofErr w:type="spellStart"/>
+      <w:r>
+        <w:t>moteur</w:t>
+      </w:r>
+      <w:proofErr w:type="spellEnd"/>
+      <w:r>
+        <w:t xml:space="preserve"> applique :</w:t>
+      </w:r>
+    </w:p>
+    <w:p>
+      <w:pPr>
+        <w:pStyle w:val="Listepuces"/>
+        <w:rPr>
+          <w:lang w:val="fr-FR"/>
+        </w:rPr>
+      </w:pPr>
+      <w:r>
+        <w:rPr>
+          <w:lang w:val="fr-FR"/>
+        </w:rPr>
+        <w:t xml:space="preserve">- Si score &gt; 5 : bonus = (score-5) × </w:t>
+      </w:r>
+      <w:proofErr w:type="spellStart"/>
+      <w:r>
+        <w:rPr>
+          <w:lang w:val="fr-FR"/>
+        </w:rPr>
+        <w:t>coeff</w:t>
+      </w:r>
+      <w:proofErr w:type="spellEnd"/>
+      <w:r>
+        <w:rPr>
+          <w:lang w:val="fr-FR"/>
+        </w:rPr>
+        <w:t xml:space="preserve"> × 0.5 (normalisation)</w:t>
+      </w:r>
+    </w:p>
+    <w:p>
+      <w:pPr>
+        <w:pStyle w:val="Listepuces"/>
+        <w:rPr>
+          <w:lang w:val="fr-FR"/>
+        </w:rPr>
+      </w:pPr>
+      <w:r>
+        <w:rPr>
+          <w:lang w:val="fr-FR"/>
+        </w:rPr>
+        <w:t xml:space="preserve">- Si score &lt; 3 : malus </w:t>
+      </w:r>
+      <w:r>
+        <w:rPr>
+          <w:lang w:val="fr-FR"/>
+        </w:rPr>
+        <w:t xml:space="preserve">= (3-score) × </w:t>
+      </w:r>
+      <w:proofErr w:type="spellStart"/>
+      <w:r>
+        <w:rPr>
+          <w:lang w:val="fr-FR"/>
+        </w:rPr>
+        <w:t>coeff</w:t>
+      </w:r>
+      <w:proofErr w:type="spellEnd"/>
+      <w:r>
+        <w:rPr>
+          <w:lang w:val="fr-FR"/>
+        </w:rPr>
+        <w:t xml:space="preserve"> × 0.5 × 0.7 (pénalité renforcée)</w:t>
+      </w:r>
+    </w:p>
+    <w:p>
+      <w:pPr>
+        <w:pStyle w:val="Listepuces"/>
+        <w:rPr>
+          <w:lang w:val="fr-FR"/>
+        </w:rPr>
+      </w:pPr>
+      <w:r>
+        <w:rPr>
+          <w:lang w:val="fr-FR"/>
+        </w:rPr>
+        <w:lastRenderedPageBreak/>
+        <w:t>- Un plafond de 15 points par domaine évite une surpondération.</w:t>
+      </w:r>
+    </w:p>
+    <w:p>
+      <w:pPr>
+        <w:pStyle w:val="Titre2"/>
+        <w:rPr>
+          <w:lang w:val="fr-FR"/>
+        </w:rPr>
+      </w:pPr>
+      <w:r>
+        <w:rPr>
+          <w:lang w:val="fr-FR"/>
+        </w:rPr>
+        <w:t>4.3 Règles Valeurs professionnelles</w:t>
+      </w:r>
+    </w:p>
+    <w:p>
+      <w:pPr>
+        <w:rPr>
+          <w:lang w:val="fr-FR"/>
+        </w:rPr>
+      </w:pPr>
+      <w:r>
+        <w:rPr>
+          <w:lang w:val="fr-FR"/>
+        </w:rPr>
+        <w:t>Même logique que RIASEC avec 6 valeurs : Stabilité, Créativité, Impact social, Prestige, Autonomie, Lea</w:t>
+      </w:r>
+      <w:r>
+        <w:rPr>
+          <w:lang w:val="fr-FR"/>
+        </w:rPr>
+        <w:t>dership. Une matrice de correspondance lie chaque valeur aux domaines.</w:t>
+      </w:r>
+    </w:p>
+    <w:p>
+      <w:pPr>
+        <w:pStyle w:val="Titre1"/>
+        <w:rPr>
+          <w:lang w:val="fr-FR"/>
+        </w:rPr>
+      </w:pPr>
+      <w:r>
+        <w:rPr>
+          <w:lang w:val="fr-FR"/>
+        </w:rPr>
+        <w:t>5. Modèle RIASEC (Holland)</w:t>
+      </w:r>
+    </w:p>
+    <w:p>
+      <w:pPr>
+        <w:rPr>
+          <w:lang w:val="fr-FR"/>
+        </w:rPr>
+      </w:pPr>
+      <w:r>
+        <w:rPr>
+          <w:lang w:val="fr-FR"/>
+        </w:rPr>
+        <w:t>Développé par John Holland, ce modèle classe les personnalités professionnelles en 6 types : Réaliste (R), Investigateur (I), Artistique (A), Social (S), Entr</w:t>
+      </w:r>
+      <w:r>
+        <w:rPr>
+          <w:lang w:val="fr-FR"/>
+        </w:rPr>
+        <w:t>eprenant (E), Conventionnel (C).</w:t>
       </w:r>
     </w:p>
     <w:p>
@@ -606,13 +932,7 @@
         <w:rPr>
           <w:lang w:val="fr-FR"/>
         </w:rPr>
-        <w:t>- Les notes seules ne suffisent pas : un</w:t>
-      </w:r>
-      <w:r>
-        <w:rPr>
-          <w:lang w:val="fr-FR"/>
-        </w:rPr>
-        <w:t xml:space="preserve"> élève peut avoir de bonnes notes mais détester le travail en laboratoire.</w:t>
+        <w:t>- Les notes seules ne suffisent pas : un élève peut avoir de bonnes notes mais détester le travail en laboratoire.</w:t>
       </w:r>
       <w:r>
         <w:rPr>
@@ -626,13 +946,13 @@
           <w:lang w:val="fr-FR"/>
         </w:rPr>
         <w:br/>
-        <w:t>- Dans notre système, l’élève note chaque dimension de 1 à 10 ; une matrice de correspondance app</w:t>
+        <w:t>- D</w:t>
       </w:r>
       <w:r>
         <w:rPr>
           <w:lang w:val="fr-FR"/>
         </w:rPr>
-        <w:t>lique bonus/malus (score &gt;5 bonus, &lt;3 malus) avec normalisation.</w:t>
+        <w:t>ans notre système, une matrice de correspondance applique bonus/malus avec normalisation.</w:t>
       </w:r>
     </w:p>
     <w:p>
@@ -646,8 +966,7 @@
         <w:rPr>
           <w:lang w:val="fr-FR"/>
         </w:rPr>
-        <w:lastRenderedPageBreak/>
-        <w:t>4. Valeurs professionnelles</w:t>
+        <w:t>6. Valeurs professionnelles</w:t>
       </w:r>
     </w:p>
     <w:p>
@@ -660,27 +979,13 @@
         <w:rPr>
           <w:lang w:val="fr-FR"/>
         </w:rPr>
-        <w:t xml:space="preserve">Les valeurs professionnelles sont les motivations profondes qui guident une personne dans sa carrière (Super, Schein). 6 valeurs retenues : Stabilité, Créativité, </w:t>
+        <w:t xml:space="preserve">Les valeurs professionnelles sont les motivations profondes qui guident une personne dans sa carrière (Super, Schein). 6 valeurs retenues </w:t>
       </w:r>
       <w:r>
         <w:rPr>
           <w:lang w:val="fr-FR"/>
         </w:rPr>
-        <w:t xml:space="preserve">Impact social, </w:t>
-      </w:r>
-      <w:bookmarkStart w:id="0" w:name="_GoBack"/>
-      <w:r>
-        <w:rPr>
-          <w:lang w:val="fr-FR"/>
-        </w:rPr>
-        <w:t>Prestige</w:t>
-      </w:r>
-      <w:bookmarkEnd w:id="0"/>
-      <w:r>
-        <w:rPr>
-          <w:lang w:val="fr-FR"/>
-        </w:rPr>
-        <w:t>, Autonomie, Leadership.</w:t>
+        <w:t>: Stabilité, Créativité, Impact social, Prestige, Autonomie, Leadership.</w:t>
       </w:r>
     </w:p>
     <w:p>
@@ -707,26 +1012,20 @@
         <w:rPr>
           <w:lang w:val="fr-FR"/>
         </w:rPr>
-        <w:t>- Un métier peut être académiqu</w:t>
-      </w:r>
-      <w:r>
-        <w:rPr>
-          <w:lang w:val="fr-FR"/>
-        </w:rPr>
-        <w:t>ement accessible mais psychologiquement insatisfaisant si les valeurs ne sont pas alignées.</w:t>
+        <w:t>- Un métier peut être académiquement accessible mais psychologiquement insatisfaisant si les valeurs ne sont pas alignées.</w:t>
       </w:r>
       <w:r>
         <w:rPr>
           <w:lang w:val="fr-FR"/>
         </w:rPr>
         <w:br/>
-        <w:t>- Exemple : un élève très créatif sera malheureux en comptabil</w:t>
+        <w:t>- Exemple : un élève très créatif ser</w:t>
       </w:r>
       <w:r>
         <w:rPr>
           <w:lang w:val="fr-FR"/>
         </w:rPr>
-        <w:t>ité.</w:t>
+        <w:t>a malheureux en comptabilité.</w:t>
       </w:r>
       <w:r>
         <w:rPr>
@@ -739,28 +1038,10 @@
     <w:p>
       <w:pPr>
         <w:pStyle w:val="Titre1"/>
-        <w:rPr>
-          <w:lang w:val="fr-FR"/>
-        </w:rPr>
       </w:pPr>
       <w:r>
-        <w:rPr>
-          <w:lang w:val="fr-FR"/>
-        </w:rPr>
-        <w:t>5. Diagramme de classes</w:t>
-      </w:r>
-    </w:p>
-    <w:p>
-      <w:pPr>
-        <w:rPr>
-          <w:lang w:val="fr-FR"/>
-        </w:rPr>
-      </w:pPr>
-      <w:r>
-        <w:rPr>
-          <w:lang w:val="fr-FR"/>
-        </w:rPr>
-        <w:t>Ci-dessous l’architecture orientée objet du système.</w:t>
+        <w:lastRenderedPageBreak/>
+        <w:t>7. Diagramme de classes</w:t>
       </w:r>
     </w:p>
     <w:p>
@@ -773,7 +1054,7 @@
           <wp:inline distT="0" distB="0" distL="0" distR="0">
             <wp:extent cx="5486400" cy="3165310"/>
             <wp:effectExtent l="0" t="0" r="0" b="0"/>
-            <wp:docPr id="1" name="Picture 1"/>
+            <wp:docPr id="2" name="Picture 2"/>
             <wp:cNvGraphicFramePr>
               <a:graphicFrameLocks xmlns:a="http://schemas.openxmlformats.org/drawingml/2006/main" noChangeAspect="1"/>
             </wp:cNvGraphicFramePr>
@@ -785,7 +1066,7 @@
                     <pic:cNvPicPr/>
                   </pic:nvPicPr>
                   <pic:blipFill>
-                    <a:blip r:embed="rId10"/>
+                    <a:blip r:embed="rId11"/>
                     <a:stretch>
                       <a:fillRect/>
                     </a:stretch>
@@ -872,13 +1153,13 @@
         <w:rPr>
           <w:lang w:val="fr-FR"/>
         </w:rPr>
-        <w:t xml:space="preserve"> (règles </w:t>
+        <w:t xml:space="preserve"> (règles académiques, RIASEC, valeurs)</w:t>
       </w:r>
       <w:r>
         <w:rPr>
           <w:lang w:val="fr-FR"/>
         </w:rPr>
-        <w:t xml:space="preserve">académiques, RIASEC, valeurs), </w:t>
+        <w:t xml:space="preserve">, </w:t>
       </w:r>
       <w:proofErr w:type="spellStart"/>
       <w:r>
@@ -1004,57 +1285,80 @@
         <w:rPr>
           <w:lang w:val="fr-FR"/>
         </w:rPr>
-        <w:lastRenderedPageBreak/>
-        <w:t>6. Diagramme de co</w:t>
+        <w:t>8. Génération automatique de lettre de motivati</w:t>
       </w:r>
       <w:r>
         <w:rPr>
           <w:lang w:val="fr-FR"/>
         </w:rPr>
-        <w:t>mmunication (flux des données)</w:t>
+        <w:t>on et conseils</w:t>
       </w:r>
     </w:p>
     <w:p>
       <w:r>
         <w:rPr>
-          <w:noProof/>
-          <w:lang w:val="fr-FR" w:eastAsia="fr-FR"/>
+          <w:lang w:val="fr-FR"/>
         </w:rPr>
-        <w:drawing>
-          <wp:inline distT="0" distB="0" distL="0" distR="0">
-            <wp:extent cx="5486400" cy="5524150"/>
-            <wp:effectExtent l="0" t="0" r="0" b="0"/>
-            <wp:docPr id="2" name="Picture 2"/>
-            <wp:cNvGraphicFramePr>
-              <a:graphicFrameLocks xmlns:a="http://schemas.openxmlformats.org/drawingml/2006/main" noChangeAspect="1"/>
-            </wp:cNvGraphicFramePr>
-            <a:graphic xmlns:a="http://schemas.openxmlformats.org/drawingml/2006/main">
-              <a:graphicData uri="http://schemas.openxmlformats.org/drawingml/2006/picture">
-                <pic:pic xmlns:pic="http://schemas.openxmlformats.org/drawingml/2006/picture">
-                  <pic:nvPicPr>
-                    <pic:cNvPr id="0" name="Communication2.png"/>
-                    <pic:cNvPicPr/>
-                  </pic:nvPicPr>
-                  <pic:blipFill>
-                    <a:blip r:embed="rId11"/>
-                    <a:stretch>
-                      <a:fillRect/>
-                    </a:stretch>
-                  </pic:blipFill>
-                  <pic:spPr>
-                    <a:xfrm>
-                      <a:off x="0" y="0"/>
-                      <a:ext cx="5486400" cy="5524150"/>
-                    </a:xfrm>
-                    <a:prstGeom prst="rect">
-                      <a:avLst/>
-                    </a:prstGeom>
-                  </pic:spPr>
-                </pic:pic>
-              </a:graphicData>
-            </a:graphic>
-          </wp:inline>
-        </w:drawing>
+        <w:t xml:space="preserve">Le système intègre une API Google Gemini (modèle génératif) pour produire une lettre de motivation personnalisée ainsi que des conseils d'orientation. </w:t>
+      </w:r>
+      <w:r>
+        <w:t xml:space="preserve">Après </w:t>
+      </w:r>
+      <w:proofErr w:type="spellStart"/>
+      <w:r>
+        <w:t>l'évaluation</w:t>
+      </w:r>
+      <w:proofErr w:type="spellEnd"/>
+      <w:r>
+        <w:t>, le LLM reçoit :</w:t>
+      </w:r>
+    </w:p>
+    <w:p>
+      <w:pPr>
+        <w:pStyle w:val="Listepuces"/>
+        <w:rPr>
+          <w:lang w:val="fr-FR"/>
+        </w:rPr>
+      </w:pPr>
+      <w:r>
+        <w:rPr>
+          <w:lang w:val="fr-FR"/>
+        </w:rPr>
+        <w:t xml:space="preserve">- Le meilleur domaine et son pourcentage de </w:t>
+      </w:r>
+      <w:r>
+        <w:rPr>
+          <w:lang w:val="fr-FR"/>
+        </w:rPr>
+        <w:t>compatibilité.</w:t>
+      </w:r>
+    </w:p>
+    <w:p>
+      <w:pPr>
+        <w:pStyle w:val="Listepuces"/>
+        <w:rPr>
+          <w:lang w:val="fr-FR"/>
+        </w:rPr>
+      </w:pPr>
+      <w:r>
+        <w:rPr>
+          <w:lang w:val="fr-FR"/>
+        </w:rPr>
+        <w:t>- Les notes, préférences, qualités, scores RIASEC et valeurs de l'étudiant.</w:t>
+      </w:r>
+    </w:p>
+    <w:p>
+      <w:pPr>
+        <w:pStyle w:val="Listepuces"/>
+        <w:rPr>
+          <w:lang w:val="fr-FR"/>
+        </w:rPr>
+      </w:pPr>
+      <w:r>
+        <w:rPr>
+          <w:lang w:val="fr-FR"/>
+        </w:rPr>
+        <w:t>- Un style d'écriture choisi (ex: formel, motivant, court).</w:t>
       </w:r>
     </w:p>
     <w:p>
@@ -1067,60 +1371,70 @@
         <w:rPr>
           <w:lang w:val="fr-FR"/>
         </w:rPr>
-        <w:t xml:space="preserve">Flux : Entrées (Notes, Préférences, Qualités, RIASEC, Valeurs) → Agrégation </w:t>
-      </w:r>
-      <w:proofErr w:type="spellStart"/>
-      <w:r>
-        <w:rPr>
-          <w:lang w:val="fr-FR"/>
-        </w:rPr>
-        <w:t>StudentFact</w:t>
-      </w:r>
-      <w:proofErr w:type="spellEnd"/>
-      <w:r>
-        <w:rPr>
-          <w:lang w:val="fr-FR"/>
-        </w:rPr>
-        <w:t xml:space="preserve"> → Règles (académiques + RIASEC/valeurs) + </w:t>
-      </w:r>
-      <w:proofErr w:type="spellStart"/>
-      <w:r>
-        <w:rPr>
-          <w:lang w:val="fr-FR"/>
-        </w:rPr>
-        <w:t>BonusCalculator</w:t>
-      </w:r>
-      <w:proofErr w:type="spellEnd"/>
-      <w:r>
-        <w:rPr>
-          <w:lang w:val="fr-FR"/>
-        </w:rPr>
-        <w:t xml:space="preserve"> (préférences) → </w:t>
-      </w:r>
-      <w:proofErr w:type="spellStart"/>
-      <w:r>
-        <w:rPr>
-          <w:lang w:val="fr-FR"/>
-        </w:rPr>
-        <w:t>ScoreCalculator</w:t>
-      </w:r>
-      <w:proofErr w:type="spellEnd"/>
-      <w:r>
-        <w:rPr>
-          <w:lang w:val="fr-FR"/>
-        </w:rPr>
-        <w:t xml:space="preserve"> total → Conversion % → Sorties (pourcentages,</w:t>
+        <w:t>La lettre générée est présentée dans l'interface et peut être copiée ou sauvegardée. Cela permet d'obteni</w:t>
       </w:r>
       <w:r>
         <w:rPr>
           <w:lang w:val="fr-FR"/>
         </w:rPr>
-        <w:t xml:space="preserve"> graphique, recommandation, lettre). Le flux est séquentiel, correspondant à un chaînage avant pur.</w:t>
+        <w:t>r un retour à la fois technique et humain, renforçant l'aspect personnalisé du conseil d'orientation.</w:t>
+      </w:r>
+    </w:p>
+    <w:p>
+      <w:pPr>
+        <w:pStyle w:val="Titre1"/>
+        <w:rPr>
+          <w:lang w:val="fr-FR"/>
+        </w:rPr>
+      </w:pPr>
+      <w:r>
+        <w:rPr>
+          <w:lang w:val="fr-FR"/>
+        </w:rPr>
+        <w:t>9. Conclusion</w:t>
+      </w:r>
+    </w:p>
+    <w:p>
+      <w:pPr>
+        <w:rPr>
+          <w:lang w:val="fr-FR"/>
+        </w:rPr>
+      </w:pPr>
+      <w:r>
+        <w:rPr>
+          <w:lang w:val="fr-FR"/>
+        </w:rPr>
+        <w:t>L'intégration des modèles RIASEC et des valeurs professionnelles améliore significativement la précision et la pertinence des recommandation</w:t>
+      </w:r>
+      <w:r>
+        <w:rPr>
+          <w:lang w:val="fr-FR"/>
+        </w:rPr>
+        <w:t xml:space="preserve">s. Le système ne se limite plus aux performances scolaires ; il prend en compte la personnalité et les motivations profondes de l’élève. L’architecture orientée objet, couplée à un moteur à </w:t>
+      </w:r>
+      <w:r>
+        <w:rPr>
+          <w:lang w:val="fr-FR"/>
+        </w:rPr>
+        <w:lastRenderedPageBreak/>
+        <w:t xml:space="preserve">chaînage avant, rend le code modulaire, maintenable et extensible </w:t>
+      </w:r>
+      <w:r>
+        <w:rPr>
+          <w:lang w:val="fr-FR"/>
+        </w:rPr>
+        <w:t xml:space="preserve">à d’autres domaines d’orientation. L'utilisation d'un LLM (Gemini) pour générer une lettre de motivation apporte une valeur ajoutée qualitative, transformant le résultat chiffré en un conseil personnalisé et engageant. Ce travail constitue une base solide </w:t>
+      </w:r>
+      <w:r>
+        <w:rPr>
+          <w:lang w:val="fr-FR"/>
+        </w:rPr>
+        <w:t>pour un outil d'aide à l'orientation réellement adapté aux besoins des élèves.</w:t>
       </w:r>
     </w:p>
     <w:sectPr>
       <w:pgSz w:w="12240" w:h="15840"/>
-      <w:pgMar w:top="1440" w:right="1800" w:bottom="1440" w:left="1800" w:header="397" w:footer="720" w:gutter="0"/>
+      <w:pgMar w:top="1440" w:right="1800" w:bottom="1440" w:left="1800" w:header="397" w:footer="397" w:gutter="0"/>
       <w:cols w:space="720"/>
       <w:docGrid w:linePitch="360"/>
     </w:sectPr>
@@ -12548,7 +12862,7 @@
     <w:uiPriority w:val="99"/>
     <w:semiHidden/>
     <w:unhideWhenUsed/>
-    <w:rsid w:val="00D528CB"/>
+    <w:rsid w:val="00E2712F"/>
     <w:pPr>
       <w:spacing w:after="0" w:line="240" w:lineRule="auto"/>
     </w:pPr>
@@ -12564,7 +12878,7 @@
     <w:link w:val="Textedebulles"/>
     <w:uiPriority w:val="99"/>
     <w:semiHidden/>
-    <w:rsid w:val="00D528CB"/>
+    <w:rsid w:val="00E2712F"/>
     <w:rPr>
       <w:rFonts w:ascii="Tahoma" w:hAnsi="Tahoma" w:cs="Tahoma"/>
       <w:sz w:val="16"/>
@@ -23741,7 +24055,7 @@
     <w:uiPriority w:val="99"/>
     <w:semiHidden/>
     <w:unhideWhenUsed/>
-    <w:rsid w:val="00D528CB"/>
+    <w:rsid w:val="00E2712F"/>
     <w:pPr>
       <w:spacing w:after="0" w:line="240" w:lineRule="auto"/>
     </w:pPr>
@@ -23757,7 +24071,7 @@
     <w:link w:val="Textedebulles"/>
     <w:uiPriority w:val="99"/>
     <w:semiHidden/>
-    <w:rsid w:val="00D528CB"/>
+    <w:rsid w:val="00E2712F"/>
     <w:rPr>
       <w:rFonts w:ascii="Tahoma" w:hAnsi="Tahoma" w:cs="Tahoma"/>
       <w:sz w:val="16"/>
@@ -24092,7 +24406,7 @@
 </file>
 
 <file path=customXml/itemProps1.xml><?xml version="1.0" encoding="utf-8"?>
-<ds:datastoreItem xmlns:ds="http://schemas.openxmlformats.org/officeDocument/2006/customXml" ds:itemID="{BC21C5E9-40BC-4488-B6B6-E83A5D05AF79}">
+<ds:datastoreItem xmlns:ds="http://schemas.openxmlformats.org/officeDocument/2006/customXml" ds:itemID="{6A9EC010-4C01-4DD4-84D2-5C7148BEFAAF}">
   <ds:schemaRefs>
     <ds:schemaRef ds:uri="http://schemas.openxmlformats.org/officeDocument/2006/bibliography"/>
   </ds:schemaRefs>

</xml_diff>